<commit_message>
Publish coordinated email and WhatsApp outreach materials
</commit_message>
<xml_diff>
--- a/SKYROTE13/kit-comercial/Nexo-Guia-y-correos-editables.docx
+++ b/SKYROTE13/kit-comercial/Nexo-Guia-y-correos-editables.docx
@@ -17,7 +17,7 @@
     </w:p>
     <w:p>
       <w:r>
-        <w:t>Único adjunto para prospectos: Nexo-Alquileres-Presentacion.pdf. Esta guía y el ZIP son para tu trabajo interno.</w:t>
+        <w:t>Adjunto por correo: Nexo-Informacion-Conectada.pdf. Adjunto por WhatsApp: Nexo-WhatsApp-Informacion.jpg. Esta guía y el ZIP son para tu trabajo interno.</w:t>
       </w:r>
     </w:p>
     <w:p>
@@ -30,7 +30,7 @@
     </w:p>
     <w:p>
       <w:r>
-        <w:t>Con 50 empresas registradas ya tienes una base para empezar conversaciones. Mantén tu meta de 100 registros de hoy y separa dos tareas: completar la investigación y activar el contacto con un primer grupo de 10–15 empresas que encajen mejor. Es una propuesta de trabajo, no una estimación de respuestas o ventas.</w:t>
+        <w:t>Con 50 empresas registradas ya tienes una base para empezar conversaciones mientras completas tu meta de 100. Esta versión prepara un mensaje de correo y uno de WhatsApp para contactar hoy. Personaliza cada empresa y lleva un único seguimiento por cuenta, aunque uses ambos canales.</w:t>
       </w:r>
     </w:p>
     <w:p>
@@ -148,7 +148,7 @@
     </w:p>
     <w:p>
       <w:r>
-        <w:t>Para el primer contacto usa texto sencillo y sin adjuntos. La web en la firma basta como referencia. Envía la ficha PDF cuando pidan información, acepten revisar una propuesta de reunión o exista contexto previo. La ficha presenta el enfoque: no es una propuesta económica.</w:t>
+        <w:t>Esta versión está preparada para enviar hoy por correo con Nexo-Informacion-Conectada.pdf y por WhatsApp con Nexo-WhatsApp-Informacion.jpg. El PDF explica el enfoque y la imagen lo resume para móvil. Ambos presentan una propuesta de conversación; no son una cotización.</w:t>
       </w:r>
     </w:p>
     <w:p>
@@ -162,6 +162,14 @@
       </w:pPr>
       <w:r>
         <w:t>Día de envío: correo individual desde asesoria@nexoamedida.com. Antes del primer lote, prueba que recibes respuestas y revisa la entrega de un mensaje a una cuenta tuya.</w:t>
+      </w:r>
+    </w:p>
+    <w:p>
+      <w:pPr>
+        <w:pStyle w:val="ListBullet"/>
+      </w:pPr>
+      <w:r>
+        <w:t>Si usas correo y WhatsApp el mismo día, mantén el mismo motivo y los mismos horarios. Puedes relacionarlos indicando que también enviaste la ficha por correo, solo si ya ocurrió. Si te responden por uno, continúa por ese canal y detén los mensajes pendientes del otro.</w:t>
       </w:r>
     </w:p>
     <w:p>
@@ -356,12 +364,12 @@
         <w:pStyle w:val="Heading1"/>
       </w:pPr>
       <w:r>
-        <w:t>Primer correo · responsable identificado</w:t>
+        <w:t>Enviar hoy · Correo</w:t>
       </w:r>
     </w:p>
     <w:p>
       <w:r>
-        <w:t>Para gerencia, operaciones, administración o quien controle los alquileres. Sustituye los campos entre corchetes y verifica la observación sobre su negocio.</w:t>
+        <w:t>Adjunta Nexo-Informacion-Conectada.pdf. Personaliza la empresa y ofrece dos horarios disponibles. «Proyecto real» se refiere al proyecto desarrollado que mostrarás; no implica resultados medidos ni un cliente de referencia.</w:t>
       </w:r>
     </w:p>
     <w:p>
@@ -369,30 +377,42 @@
         <w:pStyle w:val="Heading2"/>
       </w:pPr>
       <w:r>
-        <w:t>Asunto: [Empresa]: una demo para el control de sus alquileres</w:t>
+        <w:t>Asunto: [Empresa]: ¿cada área tiene su propio Excel?</w:t>
       </w:r>
     </w:p>
     <w:p>
       <w:r>
-        <w:t>Hola, [Nombre]:</w:t>
+        <w:t>Hola, [Nombre o equipo de Empresa]:</w:t>
       </w:r>
     </w:p>
     <w:p/>
     <w:p>
       <w:r>
-        <w:t>Soy Julio, de Nexo. Vi que [Empresa] alquila [tipo de equipos].</w:t>
+        <w:t>Cuando una consulta obliga a abrir varios Excels, revisar carpetas y preguntarle a otra persona, el trabajo de todo el equipo se frena.</w:t>
       </w:r>
     </w:p>
     <w:p/>
     <w:p>
       <w:r>
-        <w:t>Desarrollo sistemas a medida para conectar equipos, clientes, contratos e historial de mantenimiento. Puedo mostrarte una demo de cómo consultar la información de un equipo y sus documentos desde una sola ficha.</w:t>
+        <w:t>Soy Julio, de Nexo. Creamos sistemas a medida para conectar esa información y facilitar el trabajo de todas las áreas: encontrar lo que necesitan más rápido, trabajar con datos actualizados y consultar el historial de cada operación.</w:t>
       </w:r>
     </w:p>
     <w:p/>
     <w:p>
       <w:r>
-        <w:t>Me gustaría conocer cómo lo gestionan hoy y ver si algo así les sería útil. ¿Podemos verlo en una reunión virtual de 15 minutos el [día y hora 1] o el [día y hora 2]? Si prefieren presencial en Lima, podemos coordinarlo.</w:t>
+        <w:t>Quiero mostrarte un proyecto real que ya desarrollamos en una reunión de 15 minutos y evaluar si podemos resolver algo similar en [Empresa].</w:t>
+      </w:r>
+    </w:p>
+    <w:p/>
+    <w:p>
+      <w:r>
+        <w:t>¿Te acomoda [día y hora 1] o [día y hora 2]? Puede ser virtual o presencial en Lima. Te adjunto una ficha visual del enfoque.</w:t>
+      </w:r>
+    </w:p>
+    <w:p/>
+    <w:p>
+      <w:r>
+        <w:t>Si este tema lo ve otra persona, ¿podrías reenviarle el mensaje o ayudarme a contactarla?</w:t>
       </w:r>
     </w:p>
     <w:p/>
@@ -419,6 +439,61 @@
     <w:p>
       <w:r>
         <w:t>nexoamedida.com</w:t>
+      </w:r>
+    </w:p>
+    <w:p>
+      <w:r>
+        <w:t>____________________________________________________________</w:t>
+      </w:r>
+    </w:p>
+    <w:p>
+      <w:pPr>
+        <w:pStyle w:val="Heading1"/>
+      </w:pPr>
+      <w:r>
+        <w:t>Enviar hoy · WhatsApp</w:t>
+      </w:r>
+    </w:p>
+    <w:p>
+      <w:r>
+        <w:t>Envía Nexo-WhatsApp-Informacion.jpg junto con este texto. Sustituye los corchetes. Si ya enviaste el correo, puedes añadir: «También te envié una ficha por correo para que puedas revisarla». Usa esa frase solo cuando realmente lo hayas enviado.</w:t>
+      </w:r>
+    </w:p>
+    <w:p>
+      <w:pPr>
+        <w:pStyle w:val="Heading2"/>
+      </w:pPr>
+      <w:r>
+        <w:t>Canal: WhatsApp</w:t>
+      </w:r>
+    </w:p>
+    <w:p>
+      <w:r>
+        <w:t>Hola, [Nombre o equipo de Empresa]. Soy Julio, de Nexo.</w:t>
+      </w:r>
+    </w:p>
+    <w:p/>
+    <w:p>
+      <w:r>
+        <w:t>¿Tienen información repartida entre Excels, carpetas y distintas personas? Cuando pasa, una consulta sencilla termina en varias búsquedas.</w:t>
+      </w:r>
+    </w:p>
+    <w:p/>
+    <w:p>
+      <w:r>
+        <w:t>Creamos sistemas a medida para conectar esos datos y facilitar el trabajo de todo el equipo.</w:t>
+      </w:r>
+    </w:p>
+    <w:p/>
+    <w:p>
+      <w:r>
+        <w:t>Quiero mostrarte un proyecto real en una demo de 15 minutos y evaluar si podemos ayudar a [Empresa].</w:t>
+      </w:r>
+    </w:p>
+    <w:p/>
+    <w:p>
+      <w:r>
+        <w:t>¿Lo vemos [día y hora 1] o [día y hora 2]? Si lo lleva otra persona, ¿me ayudas a contactarla?</w:t>
       </w:r>
     </w:p>
     <w:p>
@@ -586,7 +661,7 @@
     </w:p>
     <w:p>
       <w:r>
-        <w:t>Aquí sí adjunta Nexo-Alquileres-Presentacion.pdf. No envíes la guía interna ni el ZIP del kit.</w:t>
+        <w:t>Si te piden información, envía Nexo-Informacion-Conectada.pdf y propón revisar el proyecto desarrollado. La guía y el ZIP son de uso interno.</w:t>
       </w:r>
     </w:p>
     <w:p>
@@ -605,13 +680,13 @@
     <w:p/>
     <w:p>
       <w:r>
-        <w:t>Gracias por responder. Te adjunto una ficha de una página con el enfoque de Nexo y lo que podemos revisar en una demo.</w:t>
+        <w:t>Gracias por responder. Te adjunto una ficha visual de una página con el enfoque de Nexo y lo que podemos revisar en una demo.</w:t>
       </w:r>
     </w:p>
     <w:p/>
     <w:p>
       <w:r>
-        <w:t>El ejemplo relaciona un equipo con su cliente, documentos e historial de mantenimiento. A partir de cómo trabajan ustedes, podemos evaluar qué tendría sentido desarrollar primero.</w:t>
+        <w:t>El enfoque conecta la información que hoy puede estar repartida entre archivos, carpetas y distintas áreas. A partir de cómo trabajan ustedes, podemos evaluar qué tendría sentido desarrollar primero.</w:t>
       </w:r>
     </w:p>
     <w:p/>

</xml_diff>

<commit_message>
Publica mensajes de primer contacto e investigación de copy
</commit_message>
<xml_diff>
--- a/SKYROTE13/kit-comercial/Nexo-Guia-y-correos-editables.docx
+++ b/SKYROTE13/kit-comercial/Nexo-Guia-y-correos-editables.docx
@@ -18,6 +18,64 @@
     <w:p>
       <w:r>
         <w:t>Adjunto por correo: Nexo-Informacion-Conectada.pdf. Adjunto por WhatsApp: Nexo-WhatsApp-Informacion.jpg. Esta guía y el ZIP son para tu trabajo interno.</w:t>
+      </w:r>
+    </w:p>
+    <w:p>
+      <w:pPr>
+        <w:pStyle w:val="Heading1"/>
+      </w:pPr>
+      <w:r>
+        <w:t>Por qué estos mensajes empiezan así</w:t>
+      </w:r>
+    </w:p>
+    <w:p>
+      <w:r>
+        <w:t>Revisión del 20 de octubre de 2026. Se consultaron capítulos pertinentes de cinco libros abiertos extensos de comunicación empresarial, psicología y marketing. La investigación y sus límites se documentan en Investigacion-copy-Nexo.md. No es una prueba de conversión ni una revisión sistemática de neuromarketing.</w:t>
+      </w:r>
+    </w:p>
+    <w:p>
+      <w:r>
+        <w:t>La presentación inicial combina quién escribe, qué hace Nexo y el beneficio para el equipo. La escena posterior ayuda a imaginar el cambio sin afirmar que conocemos sus problemas. El proyecto desarrollado aporta una prueba que pueden evaluar durante la reunión.</w:t>
+      </w:r>
+    </w:p>
+    <w:p>
+      <w:pPr>
+        <w:pStyle w:val="ListBullet"/>
+      </w:pPr>
+      <w:r>
+        <w:t>El asunto expresa un beneficio. No simula una conversación previa ni atribuye un problema a la empresa.</w:t>
+      </w:r>
+    </w:p>
+    <w:p>
+      <w:pPr>
+        <w:pStyle w:val="ListBullet"/>
+      </w:pPr>
+      <w:r>
+        <w:t>La web, el PDF y la imagen respaldan el mensaje. La petición principal es coordinar una demostración de 15 minutos; no pedir cuatro acciones distintas.</w:t>
+      </w:r>
+    </w:p>
+    <w:p>
+      <w:pPr>
+        <w:pStyle w:val="ListBullet"/>
+      </w:pPr>
+      <w:r>
+        <w:t>La derivación desde ventas o informes es una forma de llegar a esa conversación. Si ya conoces al responsable, puedes omitir la frase de orientación.</w:t>
+      </w:r>
+    </w:p>
+    <w:p>
+      <w:pPr>
+        <w:pStyle w:val="ListBullet"/>
+      </w:pPr>
+      <w:r>
+        <w:t>Para personalizar, usa solo información comprobada. No añadas clientes, credenciales o cifras de ahorro que no puedas acreditar.</w:t>
+      </w:r>
+    </w:p>
+    <w:p>
+      <w:pPr>
+        <w:pStyle w:val="ListBullet"/>
+      </w:pPr>
+      <w:r>
+        <w:t>Evalúa respuestas útiles, derivaciones y reuniones confirmadas por empresa. No presentes aperturas o visitas como ventas ni atribuyas con certeza la respuesta a un canal si enviaste ambos.</w:t>
       </w:r>
     </w:p>
     <w:p>
@@ -369,7 +427,7 @@
     </w:p>
     <w:p>
       <w:r>
-        <w:t>Adjunta Nexo-Informacion-Conectada.pdf. Personaliza la empresa y ofrece dos horarios disponibles. «Proyecto real» se refiere al proyecto desarrollado que mostrarás; no implica resultados medidos ni un cliente de referencia.</w:t>
+        <w:t>Primer contacto. Adjunta Nexo-Informacion-Conectada.pdf, personaliza la empresa y ofrece dos horarios disponibles, en hora de Lima. «Proyecto real» se refiere al desarrollo que mostrarás; no implica un cliente de referencia ni ahorros medidos. Si no conoces al responsable, usa la frase de orientación final.</w:t>
       </w:r>
     </w:p>
     <w:p>
@@ -377,42 +435,48 @@
         <w:pStyle w:val="Heading2"/>
       </w:pPr>
       <w:r>
-        <w:t>Asunto: [Empresa]: ¿cada área tiene su propio Excel?</w:t>
+        <w:t>Asunto: [Empresa]: menos búsquedas, respuestas más rápidas</w:t>
       </w:r>
     </w:p>
     <w:p>
       <w:r>
-        <w:t>Hola, [Nombre o equipo de Empresa]:</w:t>
+        <w:t>Buen día, [Nombre o equipo de Empresa]:</w:t>
       </w:r>
     </w:p>
     <w:p/>
     <w:p>
       <w:r>
-        <w:t>Cuando una consulta obliga a abrir varios Excels, revisar carpetas y preguntarle a otra persona, el trabajo de todo el equipo se frena.</w:t>
+        <w:t>Soy Julio, de Nexo. Desarrollamos sistemas a medida para que su equipo dedique menos tiempo a buscar información y pueda responder más rápido.</w:t>
       </w:r>
     </w:p>
     <w:p/>
     <w:p>
       <w:r>
-        <w:t>Soy Julio, de Nexo. Creamos sistemas a medida para conectar esa información y facilitar el trabajo de todas las áreas: encontrar lo que necesitan más rápido, trabajar con datos actualizados y consultar el historial de cada operación.</w:t>
+        <w:t>Imagine atender una consulta sin revisar varios Excels, buscar documentos en distintas carpetas ni esperar a quien tiene el dato.</w:t>
       </w:r>
     </w:p>
     <w:p/>
     <w:p>
       <w:r>
-        <w:t>Quiero mostrarte un proyecto real que ya desarrollamos en una reunión de 15 minutos y evaluar si podemos resolver algo similar en [Empresa].</w:t>
+        <w:t>Me gustaría mostrarle un proyecto real que ya desarrollamos y revisar si ese enfoque encaja con la operación de [Empresa].</w:t>
       </w:r>
     </w:p>
     <w:p/>
     <w:p>
       <w:r>
-        <w:t>¿Te acomoda [día y hora 1] o [día y hora 2]? Puede ser virtual o presencial en Lima. Te adjunto una ficha visual del enfoque.</w:t>
+        <w:t>Adjunto una ficha breve. También puede conocernos en https://nexoamedida.com.</w:t>
       </w:r>
     </w:p>
     <w:p/>
     <w:p>
       <w:r>
-        <w:t>Si este tema lo ve otra persona, ¿podrías reenviarle el mensaje o ayudarme a contactarla?</w:t>
+        <w:t>¿Le acomoda [día y hora 1] o [día y hora 2] para una demostración virtual de 15 minutos?</w:t>
+      </w:r>
+    </w:p>
+    <w:p/>
+    <w:p>
+      <w:r>
+        <w:t>Si este tema lo lleva otra persona, agradeceré que me ayude a llegar a ella.</w:t>
       </w:r>
     </w:p>
     <w:p/>
@@ -438,11 +502,6 @@
     </w:p>
     <w:p>
       <w:r>
-        <w:t>nexoamedida.com</w:t>
-      </w:r>
-    </w:p>
-    <w:p>
-      <w:r>
         <w:t>____________________________________________________________</w:t>
       </w:r>
     </w:p>
@@ -456,7 +515,7 @@
     </w:p>
     <w:p>
       <w:r>
-        <w:t>Envía Nexo-WhatsApp-Informacion.jpg junto con este texto. Sustituye los corchetes. Si ya enviaste el correo, puedes añadir: «También te envié una ficha por correo para que puedas revisarla». Usa esa frase solo cuando realmente lo hayas enviado.</w:t>
+        <w:t>Primer contacto. Envía Nexo-WhatsApp-Informacion.jpg con este texto. Sustituye los corchetes y usa los mismos horarios del correo, en hora de Lima. Si ya enviaste el correo, puedes añadir «También le envié una ficha por correo para que pueda revisarla». Usa esa frase solo si realmente lo enviaste.</w:t>
       </w:r>
     </w:p>
     <w:p>
@@ -469,31 +528,37 @@
     </w:p>
     <w:p>
       <w:r>
-        <w:t>Hola, [Nombre o equipo de Empresa]. Soy Julio, de Nexo.</w:t>
+        <w:t>Buen día, [Nombre o equipo de Empresa]. Soy Julio, de Nexo. Creamos sistemas a medida para que su equipo encuentre la información que necesita y responda más rápido.</w:t>
       </w:r>
     </w:p>
     <w:p/>
     <w:p>
       <w:r>
-        <w:t>¿Tienen información repartida entre Excels, carpetas y distintas personas? Cuando pasa, una consulta sencilla termina en varias búsquedas.</w:t>
+        <w:t>El cambio que buscamos: pasar de buscar entre archivos y personas a resolver una consulta con la información a mano.</w:t>
       </w:r>
     </w:p>
     <w:p/>
     <w:p>
       <w:r>
-        <w:t>Creamos sistemas a medida para conectar esos datos y facilitar el trabajo de todo el equipo.</w:t>
+        <w:t>Quisiera mostrarle un proyecto real que desarrollamos y evaluar si puede servirle a [Empresa].</w:t>
       </w:r>
     </w:p>
     <w:p/>
     <w:p>
       <w:r>
-        <w:t>Quiero mostrarte un proyecto real en una demo de 15 minutos y evaluar si podemos ayudar a [Empresa].</w:t>
+        <w:t>Le comparto una imagen del enfoque. Puede conocernos en https://nexoamedida.com.</w:t>
       </w:r>
     </w:p>
     <w:p/>
     <w:p>
       <w:r>
-        <w:t>¿Lo vemos [día y hora 1] o [día y hora 2]? Si lo lleva otra persona, ¿me ayudas a contactarla?</w:t>
+        <w:t>¿Le acomoda [día y hora 1] o [día y hora 2] para una demostración virtual de 15 minutos?</w:t>
+      </w:r>
+    </w:p>
+    <w:p/>
+    <w:p>
+      <w:r>
+        <w:t>Si lo coordina otra persona, agradeceré su orientación.</w:t>
       </w:r>
     </w:p>
     <w:p>

</xml_diff>

<commit_message>
Publica PDF e imagen comercial con comparación clara y llamada a coordinar
</commit_message>
<xml_diff>
--- a/SKYROTE13/kit-comercial/Nexo-Guia-y-correos-editables.docx
+++ b/SKYROTE13/kit-comercial/Nexo-Guia-y-correos-editables.docx
@@ -36,6 +36,11 @@
     <w:p>
       <w:r>
         <w:t>La presentación inicial combina quién escribe, qué hace Nexo y el beneficio para el equipo. La escena posterior ayuda a imaginar el cambio sin afirmar que conocemos sus problemas. El proyecto desarrollado aporta una prueba que pueden evaluar durante la reunión.</w:t>
+      </w:r>
+    </w:p>
+    <w:p>
+      <w:r>
+        <w:t>Los adjuntos abren con «Menos búsquedas. Más respuestas.», presentan a Nexo y explican una consulta sobre el contrato de un equipo. El PDF permite coordinar por WhatsApp; la imagen invita a responder al mensaje de Julio. Conserva la misma propuesta de reunión y los mismos horarios en ambos canales.</w:t>
       </w:r>
     </w:p>
     <w:p>

</xml_diff>